<commit_message>
W-1: sessions the rewritten-file fix touches re-recorded; the dated capability-and-cost note at the top (owner)
Modify, strength reduction, broken file and report re-run on all five models
(ad hoc sweep too where it was affected); every Opus number unchanged and its
workbooks byte-identical. Interim: gpt-6-astra's ad hoc, strength reduction,
broken-file and report sessions are still the earlier recording (the spend
stop was reached); to be finished before the page goes to the owner.

Co-Authored-By: Claude Opus 5.5 <noreply@anthropic.com>
Claude-Session: https://claude.ai/code/session_01XjjT2aBxw8gY7EFdpoUcpj
</commit_message>
<xml_diff>
--- a/docs/tutorials/files/w1_report_after.docx
+++ b/docs/tutorials/files/w1_report_after.docx
@@ -40,7 +40,7 @@
     <w:p/>
     <w:tbl>
       <w:tblPr>
-        <w:tblW w:type="dxa" w:w="2607"/>
+        <w:tblW w:type="dxa" w:w="2604"/>
         <w:jc w:val="left"/>
         <w:tblLayout w:type="fixed"/>
         <w:tblCellMar>
@@ -53,7 +53,7 @@
       </w:tblPr>
       <w:tblGrid>
         <w:gridCol w:w="666"/>
-        <w:gridCol w:w="1941"/>
+        <w:gridCol w:w="1938"/>
       </w:tblGrid>
       <w:tr>
         <w:tc>
@@ -80,7 +80,7 @@
         </w:tc>
         <w:tc>
           <w:tcPr>
-            <w:tcW w:type="dxa" w:w="1941"/>
+            <w:tcW w:type="dxa" w:w="1938"/>
             <w:vAlign w:val="center"/>
           </w:tcPr>
           <w:p>
@@ -100,7 +100,7 @@
               <w:rPr>
                 <w:sz w:val="21"/>
               </w:rPr>
-              <w:t>October 10, 2026</w:t>
+              <w:t>October 11, 2026</w:t>
             </w:r>
           </w:p>
         </w:tc>
@@ -468,7 +468,7 @@
                 <w:b w:val="0"/>
                 <w:sz w:val="20"/>
               </w:rPr>
-              <w:t>2026-10-10 23:48</w:t>
+              <w:t>2026-10-11 07:20</w:t>
             </w:r>
           </w:p>
         </w:tc>
@@ -23929,7 +23929,7 @@
       <w:rPr>
         <w:sz w:val="18"/>
       </w:rPr>
-      <w:t xml:space="preserve">     |     October 10, 2026</w:t>
+      <w:t xml:space="preserve">     |     October 11, 2026</w:t>
     </w:r>
   </w:p>
 </w:ftr>

</xml_diff>